<commit_message>
Update agent metadata and clean up user manuals
Replit-Commit-Author: Agent
</commit_message>
<xml_diff>
--- a/Reports/WHAMO_Network_Designer_User_Manual.docx
+++ b/Reports/WHAMO_Network_Designer_User_Manual.docx
@@ -13834,192 +13834,6 @@
       <w:pPr>
         <w:spacing w:after="100"/>
       </w:pPr>
-    </w:p>
-    <w:p>
-      <w:r>
-        <w:br w:type="page"/>
-      </w:r>
-    </w:p>
-    <w:p>
-      <w:pPr>
-        <w:pStyle w:val="Heading2"/>
-        <w:keepNext/>
-        <w:keepLines/>
-        <w:pBdr>
-          <w:bottom w:val="single" w:color="000000" w:sz="6" w:space="7"/>
-        </w:pBdr>
-        <w:spacing w:after="120" w:before="210"/>
-      </w:pPr>
-      <w:r>
-        <w:t xml:space="preserve">Before final submission</w:t>
-      </w:r>
-    </w:p>
-    <w:p>
-      <w:pPr>
-        <w:keepLines/>
-        <w:widowControl/>
-        <w:spacing w:after="150" w:line="300"/>
-      </w:pPr>
-      <w:r>
-        <w:rPr>
-          <w:rFonts w:ascii="Calibri" w:cs="Calibri" w:eastAsia="Calibri" w:hAnsi="Calibri"/>
-          <w:color w:val="000000"/>
-          <w:sz w:val="22"/>
-          <w:szCs w:val="22"/>
-        </w:rPr>
-        <w:t xml:space="preserve">This manual is written from the current project interface and source. Before submitting it:</w:t>
-      </w:r>
-    </w:p>
-    <w:p>
-      <w:pPr>
-        <w:keepLines/>
-        <w:spacing w:after="100" w:line="290"/>
-        <w:ind w:left="360" w:hanging="240"/>
-      </w:pPr>
-      <w:r>
-        <w:rPr>
-          <w:rFonts w:ascii="Calibri" w:cs="Calibri" w:eastAsia="Calibri" w:hAnsi="Calibri"/>
-          <w:b/>
-          <w:bCs/>
-          <w:color w:val="000000"/>
-          <w:sz w:val="21"/>
-          <w:szCs w:val="21"/>
-        </w:rPr>
-        <w:t xml:space="preserve">1.  </w:t>
-      </w:r>
-      <w:r>
-        <w:rPr>
-          <w:rFonts w:ascii="Calibri" w:cs="Calibri" w:eastAsia="Calibri" w:hAnsi="Calibri"/>
-          <w:color w:val="000000"/>
-          <w:sz w:val="22"/>
-          <w:szCs w:val="22"/>
-        </w:rPr>
-        <w:t xml:space="preserve">Replace the author and organization fields on the cover.</w:t>
-      </w:r>
-    </w:p>
-    <w:p>
-      <w:pPr>
-        <w:keepLines/>
-        <w:spacing w:after="100" w:line="290"/>
-        <w:ind w:left="360" w:hanging="240"/>
-      </w:pPr>
-      <w:r>
-        <w:rPr>
-          <w:rFonts w:ascii="Calibri" w:cs="Calibri" w:eastAsia="Calibri" w:hAnsi="Calibri"/>
-          <w:b/>
-          <w:bCs/>
-          <w:color w:val="000000"/>
-          <w:sz w:val="21"/>
-          <w:szCs w:val="21"/>
-        </w:rPr>
-        <w:t xml:space="preserve">2.  </w:t>
-      </w:r>
-      <w:r>
-        <w:rPr>
-          <w:rFonts w:ascii="Calibri" w:cs="Calibri" w:eastAsia="Calibri" w:hAnsi="Calibri"/>
-          <w:color w:val="000000"/>
-          <w:sz w:val="22"/>
-          <w:szCs w:val="22"/>
-        </w:rPr>
-        <w:t xml:space="preserve">Confirm that the deployed application still displays version 1.0 and that the described controls match the deployed build.</w:t>
-      </w:r>
-    </w:p>
-    <w:p>
-      <w:pPr>
-        <w:keepLines/>
-        <w:spacing w:after="100" w:line="290"/>
-        <w:ind w:left="360" w:hanging="240"/>
-      </w:pPr>
-      <w:r>
-        <w:rPr>
-          <w:rFonts w:ascii="Calibri" w:cs="Calibri" w:eastAsia="Calibri" w:hAnsi="Calibri"/>
-          <w:b/>
-          <w:bCs/>
-          <w:color w:val="000000"/>
-          <w:sz w:val="21"/>
-          <w:szCs w:val="21"/>
-        </w:rPr>
-        <w:t xml:space="preserve">3.  </w:t>
-      </w:r>
-      <w:r>
-        <w:rPr>
-          <w:rFonts w:ascii="Calibri" w:cs="Calibri" w:eastAsia="Calibri" w:hAnsi="Calibri"/>
-          <w:color w:val="000000"/>
-          <w:sz w:val="22"/>
-          <w:szCs w:val="22"/>
-        </w:rPr>
-        <w:t xml:space="preserve">Add screenshots captured from the final authenticated application if required by the reviewer. Use sanitized example data and hide account details.</w:t>
-      </w:r>
-    </w:p>
-    <w:p>
-      <w:pPr>
-        <w:keepLines/>
-        <w:spacing w:after="100" w:line="290"/>
-        <w:ind w:left="360" w:hanging="240"/>
-      </w:pPr>
-      <w:r>
-        <w:rPr>
-          <w:rFonts w:ascii="Calibri" w:cs="Calibri" w:eastAsia="Calibri" w:hAnsi="Calibri"/>
-          <w:b/>
-          <w:bCs/>
-          <w:color w:val="000000"/>
-          <w:sz w:val="21"/>
-          <w:szCs w:val="21"/>
-        </w:rPr>
-        <w:t xml:space="preserve">4.  </w:t>
-      </w:r>
-      <w:r>
-        <w:rPr>
-          <w:rFonts w:ascii="Calibri" w:cs="Calibri" w:eastAsia="Calibri" w:hAnsi="Calibri"/>
-          <w:color w:val="000000"/>
-          <w:sz w:val="22"/>
-          <w:szCs w:val="22"/>
-        </w:rPr>
-        <w:t xml:space="preserve">Confirm turbine mode behavior and all generated file syntax against the specific WHAMO executable/version used for the project.</w:t>
-      </w:r>
-    </w:p>
-    <w:p>
-      <w:pPr>
-        <w:keepLines/>
-        <w:spacing w:after="100" w:line="290"/>
-        <w:ind w:left="360" w:hanging="240"/>
-      </w:pPr>
-      <w:r>
-        <w:rPr>
-          <w:rFonts w:ascii="Calibri" w:cs="Calibri" w:eastAsia="Calibri" w:hAnsi="Calibri"/>
-          <w:b/>
-          <w:bCs/>
-          <w:color w:val="000000"/>
-          <w:sz w:val="21"/>
-          <w:szCs w:val="21"/>
-        </w:rPr>
-        <w:t xml:space="preserve">5.  </w:t>
-      </w:r>
-      <w:r>
-        <w:rPr>
-          <w:rFonts w:ascii="Calibri" w:cs="Calibri" w:eastAsia="Calibri" w:hAnsi="Calibri"/>
-          <w:color w:val="000000"/>
-          <w:sz w:val="22"/>
-          <w:szCs w:val="22"/>
-        </w:rPr>
-        <w:t xml:space="preserve">Proofread the final Word/PDF copy and attach the project's reviewed source code, test evidence, and required signed declarations separately.</w:t>
-      </w:r>
-    </w:p>
-    <w:p>
-      <w:pPr>
-        <w:keepLines/>
-        <w:widowControl/>
-        <w:spacing w:after="150" w:line="300"/>
-      </w:pPr>
-      <w:r>
-        <w:rPr>
-          <w:rFonts w:ascii="Calibri" w:cs="Calibri" w:eastAsia="Calibri" w:hAnsi="Calibri"/>
-          <w:color w:val="000000"/>
-          <w:sz w:val="22"/>
-          <w:szCs w:val="22"/>
-        </w:rPr>
-        <w:t xml:space="preserve">This guide does not claim that the software, model, or simulation has been independently certified or accepted by the Ministry of Jal Shakti.</w:t>
-      </w:r>
     </w:p>
     <w:sectPr>
       <w:headerReference w:type="default" r:id="rId7"/>

</xml_diff>